<commit_message>
Update Week 5 report with 16 application screenshots
</commit_message>
<xml_diff>
--- a/Jeevan_Kumar_Gujja_Week5_Report.docx
+++ b/Jeevan_Kumar_Gujja_Week5_Report.docx
@@ -7545,6 +7545,11 @@
       </w:r>
     </w:p>
     <w:p>
+      <w:r>
+        <w:br w:type="page"/>
+      </w:r>
+    </w:p>
+    <w:p>
       <w:pPr>
         <w:pStyle w:val="Heading1"/>
         <w:spacing w:after="120" w:before="320"/>
@@ -7558,7 +7563,1309 @@
           <w:sz w:val="32"/>
           <w:szCs w:val="32"/>
         </w:rPr>
-        <w:t xml:space="preserve">8. Trainee Declaration</w:t>
+        <w:t xml:space="preserve">8. Application Screenshots</w:t>
+      </w:r>
+    </w:p>
+    <w:p>
+      <w:pPr>
+        <w:pStyle w:val="Heading2"/>
+        <w:spacing w:after="80" w:before="200"/>
+      </w:pPr>
+      <w:r>
+        <w:rPr>
+          <w:rFonts w:ascii="Calibri" w:cs="Calibri" w:eastAsia="Calibri" w:hAnsi="Calibri"/>
+          <w:b/>
+          <w:bCs/>
+          <w:color w:val="2E74B5"/>
+          <w:sz w:val="26"/>
+          <w:szCs w:val="26"/>
+        </w:rPr>
+        <w:t xml:space="preserve">Figure 1 — User Service Started (Port 8081)</w:t>
+      </w:r>
+    </w:p>
+    <w:p>
+      <w:pPr>
+        <w:spacing w:after="60" w:before="120"/>
+        <w:jc w:val="center"/>
+      </w:pPr>
+      <w:r>
+        <w:drawing>
+          <wp:inline distT="0" distB="0" distL="0" distR="0">
+            <wp:extent cx="5524500" cy="2924175"/>
+            <wp:effectExtent t="0" r="0" b="0" l="0"/>
+            <wp:docPr id="1" name="Figure 1: User Service successfully started on port 8081" descr="Figure 1: User Service successfully started on port 8081" title="Figure 1: User Service successfully started on port 8081"/>
+            <wp:cNvGraphicFramePr>
+              <a:graphicFrameLocks xmlns:a="http://schemas.openxmlformats.org/drawingml/2006/main" noChangeAspect="1"/>
+            </wp:cNvGraphicFramePr>
+            <a:graphic xmlns:a="http://schemas.openxmlformats.org/drawingml/2006/main">
+              <a:graphicData uri="http://schemas.openxmlformats.org/drawingml/2006/picture">
+                <pic:pic xmlns:pic="http://schemas.openxmlformats.org/drawingml/2006/picture">
+                  <pic:nvPicPr>
+                    <pic:cNvPr id="0" name="" descr=""/>
+                    <pic:cNvPicPr>
+                      <a:picLocks noChangeAspect="1" noChangeArrowheads="1"/>
+                    </pic:cNvPicPr>
+                  </pic:nvPicPr>
+                  <pic:blipFill>
+                    <a:blip r:embed="rId9" cstate="none"/>
+                    <a:srcRect/>
+                    <a:stretch>
+                      <a:fillRect/>
+                    </a:stretch>
+                  </pic:blipFill>
+                  <pic:spPr bwMode="auto">
+                    <a:xfrm>
+                      <a:off x="0" y="0"/>
+                      <a:ext cx="5524500" cy="2924175"/>
+                    </a:xfrm>
+                    <a:prstGeom prst="rect">
+                      <a:avLst/>
+                    </a:prstGeom>
+                  </pic:spPr>
+                </pic:pic>
+              </a:graphicData>
+            </a:graphic>
+          </wp:inline>
+        </w:drawing>
+      </w:r>
+    </w:p>
+    <w:p>
+      <w:pPr>
+        <w:spacing w:after="200"/>
+        <w:jc w:val="center"/>
+      </w:pPr>
+      <w:r>
+        <w:rPr>
+          <w:rFonts w:ascii="Calibri" w:cs="Calibri" w:eastAsia="Calibri" w:hAnsi="Calibri"/>
+          <w:i/>
+          <w:iCs/>
+          <w:color w:val="666666"/>
+          <w:sz w:val="18"/>
+          <w:szCs w:val="18"/>
+        </w:rPr>
+        <w:t xml:space="preserve">Figure 1: User Service successfully started on port 8081</w:t>
+      </w:r>
+    </w:p>
+    <w:p>
+      <w:pPr>
+        <w:pStyle w:val="Heading2"/>
+        <w:spacing w:after="80" w:before="200"/>
+      </w:pPr>
+      <w:r>
+        <w:rPr>
+          <w:rFonts w:ascii="Calibri" w:cs="Calibri" w:eastAsia="Calibri" w:hAnsi="Calibri"/>
+          <w:b/>
+          <w:bCs/>
+          <w:color w:val="2E74B5"/>
+          <w:sz w:val="26"/>
+          <w:szCs w:val="26"/>
+        </w:rPr>
+        <w:t xml:space="preserve">Figure 2 — Task Service Started (Port 8082)</w:t>
+      </w:r>
+    </w:p>
+    <w:p>
+      <w:pPr>
+        <w:spacing w:after="60" w:before="120"/>
+        <w:jc w:val="center"/>
+      </w:pPr>
+      <w:r>
+        <w:drawing>
+          <wp:inline distT="0" distB="0" distL="0" distR="0">
+            <wp:extent cx="5524500" cy="2819400"/>
+            <wp:effectExtent t="0" r="0" b="0" l="0"/>
+            <wp:docPr id="1" name="Figure 2: Task Service successfully started on port 8082" descr="Figure 2: Task Service successfully started on port 8082" title="Figure 2: Task Service successfully started on port 8082"/>
+            <wp:cNvGraphicFramePr>
+              <a:graphicFrameLocks xmlns:a="http://schemas.openxmlformats.org/drawingml/2006/main" noChangeAspect="1"/>
+            </wp:cNvGraphicFramePr>
+            <a:graphic xmlns:a="http://schemas.openxmlformats.org/drawingml/2006/main">
+              <a:graphicData uri="http://schemas.openxmlformats.org/drawingml/2006/picture">
+                <pic:pic xmlns:pic="http://schemas.openxmlformats.org/drawingml/2006/picture">
+                  <pic:nvPicPr>
+                    <pic:cNvPr id="0" name="" descr=""/>
+                    <pic:cNvPicPr>
+                      <a:picLocks noChangeAspect="1" noChangeArrowheads="1"/>
+                    </pic:cNvPicPr>
+                  </pic:nvPicPr>
+                  <pic:blipFill>
+                    <a:blip r:embed="rId10" cstate="none"/>
+                    <a:srcRect/>
+                    <a:stretch>
+                      <a:fillRect/>
+                    </a:stretch>
+                  </pic:blipFill>
+                  <pic:spPr bwMode="auto">
+                    <a:xfrm>
+                      <a:off x="0" y="0"/>
+                      <a:ext cx="5524500" cy="2819400"/>
+                    </a:xfrm>
+                    <a:prstGeom prst="rect">
+                      <a:avLst/>
+                    </a:prstGeom>
+                  </pic:spPr>
+                </pic:pic>
+              </a:graphicData>
+            </a:graphic>
+          </wp:inline>
+        </w:drawing>
+      </w:r>
+    </w:p>
+    <w:p>
+      <w:pPr>
+        <w:spacing w:after="200"/>
+        <w:jc w:val="center"/>
+      </w:pPr>
+      <w:r>
+        <w:rPr>
+          <w:rFonts w:ascii="Calibri" w:cs="Calibri" w:eastAsia="Calibri" w:hAnsi="Calibri"/>
+          <w:i/>
+          <w:iCs/>
+          <w:color w:val="666666"/>
+          <w:sz w:val="18"/>
+          <w:szCs w:val="18"/>
+        </w:rPr>
+        <w:t xml:space="preserve">Figure 2: Task Service successfully started on port 8082</w:t>
+      </w:r>
+    </w:p>
+    <w:p>
+      <w:pPr>
+        <w:pStyle w:val="Heading2"/>
+        <w:spacing w:after="80" w:before="200"/>
+      </w:pPr>
+      <w:r>
+        <w:rPr>
+          <w:rFonts w:ascii="Calibri" w:cs="Calibri" w:eastAsia="Calibri" w:hAnsi="Calibri"/>
+          <w:b/>
+          <w:bCs/>
+          <w:color w:val="2E74B5"/>
+          <w:sz w:val="26"/>
+          <w:szCs w:val="26"/>
+        </w:rPr>
+        <w:t xml:space="preserve">Figure 3 — User Service Swagger UI</w:t>
+      </w:r>
+    </w:p>
+    <w:p>
+      <w:pPr>
+        <w:spacing w:after="60" w:before="120"/>
+        <w:jc w:val="center"/>
+      </w:pPr>
+      <w:r>
+        <w:drawing>
+          <wp:inline distT="0" distB="0" distL="0" distR="0">
+            <wp:extent cx="5524500" cy="2743200"/>
+            <wp:effectExtent t="0" r="0" b="0" l="0"/>
+            <wp:docPr id="1" name="Figure 3: User Service Swagger/OpenAPI documentation at localhost:8081/swagger-ui.html" descr="Figure 3: User Service Swagger/OpenAPI documentation at localhost:8081/swagger-ui.html" title="Figure 3: User Service Swagger/OpenAPI documentation at localhost:8081/swagger-ui.html"/>
+            <wp:cNvGraphicFramePr>
+              <a:graphicFrameLocks xmlns:a="http://schemas.openxmlformats.org/drawingml/2006/main" noChangeAspect="1"/>
+            </wp:cNvGraphicFramePr>
+            <a:graphic xmlns:a="http://schemas.openxmlformats.org/drawingml/2006/main">
+              <a:graphicData uri="http://schemas.openxmlformats.org/drawingml/2006/picture">
+                <pic:pic xmlns:pic="http://schemas.openxmlformats.org/drawingml/2006/picture">
+                  <pic:nvPicPr>
+                    <pic:cNvPr id="0" name="" descr=""/>
+                    <pic:cNvPicPr>
+                      <a:picLocks noChangeAspect="1" noChangeArrowheads="1"/>
+                    </pic:cNvPicPr>
+                  </pic:nvPicPr>
+                  <pic:blipFill>
+                    <a:blip r:embed="rId11" cstate="none"/>
+                    <a:srcRect/>
+                    <a:stretch>
+                      <a:fillRect/>
+                    </a:stretch>
+                  </pic:blipFill>
+                  <pic:spPr bwMode="auto">
+                    <a:xfrm>
+                      <a:off x="0" y="0"/>
+                      <a:ext cx="5524500" cy="2743200"/>
+                    </a:xfrm>
+                    <a:prstGeom prst="rect">
+                      <a:avLst/>
+                    </a:prstGeom>
+                  </pic:spPr>
+                </pic:pic>
+              </a:graphicData>
+            </a:graphic>
+          </wp:inline>
+        </w:drawing>
+      </w:r>
+    </w:p>
+    <w:p>
+      <w:pPr>
+        <w:spacing w:after="200"/>
+        <w:jc w:val="center"/>
+      </w:pPr>
+      <w:r>
+        <w:rPr>
+          <w:rFonts w:ascii="Calibri" w:cs="Calibri" w:eastAsia="Calibri" w:hAnsi="Calibri"/>
+          <w:i/>
+          <w:iCs/>
+          <w:color w:val="666666"/>
+          <w:sz w:val="18"/>
+          <w:szCs w:val="18"/>
+        </w:rPr>
+        <w:t xml:space="preserve">Figure 3: User Service Swagger/OpenAPI documentation at localhost:8081/swagger-ui.html</w:t>
+      </w:r>
+    </w:p>
+    <w:p>
+      <w:pPr>
+        <w:pStyle w:val="Heading2"/>
+        <w:spacing w:after="80" w:before="200"/>
+      </w:pPr>
+      <w:r>
+        <w:rPr>
+          <w:rFonts w:ascii="Calibri" w:cs="Calibri" w:eastAsia="Calibri" w:hAnsi="Calibri"/>
+          <w:b/>
+          <w:bCs/>
+          <w:color w:val="2E74B5"/>
+          <w:sz w:val="26"/>
+          <w:szCs w:val="26"/>
+        </w:rPr>
+        <w:t xml:space="preserve">Figure 4 — Task Service Swagger UI</w:t>
+      </w:r>
+    </w:p>
+    <w:p>
+      <w:pPr>
+        <w:spacing w:after="60" w:before="120"/>
+        <w:jc w:val="center"/>
+      </w:pPr>
+      <w:r>
+        <w:drawing>
+          <wp:inline distT="0" distB="0" distL="0" distR="0">
+            <wp:extent cx="5524500" cy="2743200"/>
+            <wp:effectExtent t="0" r="0" b="0" l="0"/>
+            <wp:docPr id="1" name="Figure 4: Task Service Swagger/OpenAPI documentation at localhost:8082/swagger-ui.html" descr="Figure 4: Task Service Swagger/OpenAPI documentation at localhost:8082/swagger-ui.html" title="Figure 4: Task Service Swagger/OpenAPI documentation at localhost:8082/swagger-ui.html"/>
+            <wp:cNvGraphicFramePr>
+              <a:graphicFrameLocks xmlns:a="http://schemas.openxmlformats.org/drawingml/2006/main" noChangeAspect="1"/>
+            </wp:cNvGraphicFramePr>
+            <a:graphic xmlns:a="http://schemas.openxmlformats.org/drawingml/2006/main">
+              <a:graphicData uri="http://schemas.openxmlformats.org/drawingml/2006/picture">
+                <pic:pic xmlns:pic="http://schemas.openxmlformats.org/drawingml/2006/picture">
+                  <pic:nvPicPr>
+                    <pic:cNvPr id="0" name="" descr=""/>
+                    <pic:cNvPicPr>
+                      <a:picLocks noChangeAspect="1" noChangeArrowheads="1"/>
+                    </pic:cNvPicPr>
+                  </pic:nvPicPr>
+                  <pic:blipFill>
+                    <a:blip r:embed="rId12" cstate="none"/>
+                    <a:srcRect/>
+                    <a:stretch>
+                      <a:fillRect/>
+                    </a:stretch>
+                  </pic:blipFill>
+                  <pic:spPr bwMode="auto">
+                    <a:xfrm>
+                      <a:off x="0" y="0"/>
+                      <a:ext cx="5524500" cy="2743200"/>
+                    </a:xfrm>
+                    <a:prstGeom prst="rect">
+                      <a:avLst/>
+                    </a:prstGeom>
+                  </pic:spPr>
+                </pic:pic>
+              </a:graphicData>
+            </a:graphic>
+          </wp:inline>
+        </w:drawing>
+      </w:r>
+    </w:p>
+    <w:p>
+      <w:pPr>
+        <w:spacing w:after="200"/>
+        <w:jc w:val="center"/>
+      </w:pPr>
+      <w:r>
+        <w:rPr>
+          <w:rFonts w:ascii="Calibri" w:cs="Calibri" w:eastAsia="Calibri" w:hAnsi="Calibri"/>
+          <w:i/>
+          <w:iCs/>
+          <w:color w:val="666666"/>
+          <w:sz w:val="18"/>
+          <w:szCs w:val="18"/>
+        </w:rPr>
+        <w:t xml:space="preserve">Figure 4: Task Service Swagger/OpenAPI documentation at localhost:8082/swagger-ui.html</w:t>
+      </w:r>
+    </w:p>
+    <w:p>
+      <w:pPr>
+        <w:pStyle w:val="Heading2"/>
+        <w:spacing w:after="80" w:before="200"/>
+      </w:pPr>
+      <w:r>
+        <w:rPr>
+          <w:rFonts w:ascii="Calibri" w:cs="Calibri" w:eastAsia="Calibri" w:hAnsi="Calibri"/>
+          <w:b/>
+          <w:bCs/>
+          <w:color w:val="2E74B5"/>
+          <w:sz w:val="26"/>
+          <w:szCs w:val="26"/>
+        </w:rPr>
+        <w:t xml:space="preserve">Figure 5 — Register API (POST /api/auth/register)</w:t>
+      </w:r>
+    </w:p>
+    <w:p>
+      <w:pPr>
+        <w:spacing w:after="60" w:before="120"/>
+        <w:jc w:val="center"/>
+      </w:pPr>
+      <w:r>
+        <w:drawing>
+          <wp:inline distT="0" distB="0" distL="0" distR="0">
+            <wp:extent cx="5524500" cy="2724150"/>
+            <wp:effectExtent t="0" r="0" b="0" l="0"/>
+            <wp:docPr id="1" name="Figure 5: User registration via POST /api/auth/register — returns JWT token" descr="Figure 5: User registration via POST /api/auth/register — returns JWT token" title="Figure 5: User registration via POST /api/auth/register — returns JWT token"/>
+            <wp:cNvGraphicFramePr>
+              <a:graphicFrameLocks xmlns:a="http://schemas.openxmlformats.org/drawingml/2006/main" noChangeAspect="1"/>
+            </wp:cNvGraphicFramePr>
+            <a:graphic xmlns:a="http://schemas.openxmlformats.org/drawingml/2006/main">
+              <a:graphicData uri="http://schemas.openxmlformats.org/drawingml/2006/picture">
+                <pic:pic xmlns:pic="http://schemas.openxmlformats.org/drawingml/2006/picture">
+                  <pic:nvPicPr>
+                    <pic:cNvPr id="0" name="" descr=""/>
+                    <pic:cNvPicPr>
+                      <a:picLocks noChangeAspect="1" noChangeArrowheads="1"/>
+                    </pic:cNvPicPr>
+                  </pic:nvPicPr>
+                  <pic:blipFill>
+                    <a:blip r:embed="rId13" cstate="none"/>
+                    <a:srcRect/>
+                    <a:stretch>
+                      <a:fillRect/>
+                    </a:stretch>
+                  </pic:blipFill>
+                  <pic:spPr bwMode="auto">
+                    <a:xfrm>
+                      <a:off x="0" y="0"/>
+                      <a:ext cx="5524500" cy="2724150"/>
+                    </a:xfrm>
+                    <a:prstGeom prst="rect">
+                      <a:avLst/>
+                    </a:prstGeom>
+                  </pic:spPr>
+                </pic:pic>
+              </a:graphicData>
+            </a:graphic>
+          </wp:inline>
+        </w:drawing>
+      </w:r>
+    </w:p>
+    <w:p>
+      <w:pPr>
+        <w:spacing w:after="200"/>
+        <w:jc w:val="center"/>
+      </w:pPr>
+      <w:r>
+        <w:rPr>
+          <w:rFonts w:ascii="Calibri" w:cs="Calibri" w:eastAsia="Calibri" w:hAnsi="Calibri"/>
+          <w:i/>
+          <w:iCs/>
+          <w:color w:val="666666"/>
+          <w:sz w:val="18"/>
+          <w:szCs w:val="18"/>
+        </w:rPr>
+        <w:t xml:space="preserve">Figure 5: User registration via POST /api/auth/register — returns JWT token</w:t>
+      </w:r>
+    </w:p>
+    <w:p>
+      <w:pPr>
+        <w:pStyle w:val="Heading2"/>
+        <w:spacing w:after="80" w:before="200"/>
+      </w:pPr>
+      <w:r>
+        <w:rPr>
+          <w:rFonts w:ascii="Calibri" w:cs="Calibri" w:eastAsia="Calibri" w:hAnsi="Calibri"/>
+          <w:b/>
+          <w:bCs/>
+          <w:color w:val="2E74B5"/>
+          <w:sz w:val="26"/>
+          <w:szCs w:val="26"/>
+        </w:rPr>
+        <w:t xml:space="preserve">Figure 6 — Login API (POST /api/auth/login)</w:t>
+      </w:r>
+    </w:p>
+    <w:p>
+      <w:pPr>
+        <w:spacing w:after="60" w:before="120"/>
+        <w:jc w:val="center"/>
+      </w:pPr>
+      <w:r>
+        <w:drawing>
+          <wp:inline distT="0" distB="0" distL="0" distR="0">
+            <wp:extent cx="5524500" cy="2714625"/>
+            <wp:effectExtent t="0" r="0" b="0" l="0"/>
+            <wp:docPr id="1" name="Figure 6: User login via POST /api/auth/login" descr="Figure 6: User login via POST /api/auth/login" title="Figure 6: User login via POST /api/auth/login"/>
+            <wp:cNvGraphicFramePr>
+              <a:graphicFrameLocks xmlns:a="http://schemas.openxmlformats.org/drawingml/2006/main" noChangeAspect="1"/>
+            </wp:cNvGraphicFramePr>
+            <a:graphic xmlns:a="http://schemas.openxmlformats.org/drawingml/2006/main">
+              <a:graphicData uri="http://schemas.openxmlformats.org/drawingml/2006/picture">
+                <pic:pic xmlns:pic="http://schemas.openxmlformats.org/drawingml/2006/picture">
+                  <pic:nvPicPr>
+                    <pic:cNvPr id="0" name="" descr=""/>
+                    <pic:cNvPicPr>
+                      <a:picLocks noChangeAspect="1" noChangeArrowheads="1"/>
+                    </pic:cNvPicPr>
+                  </pic:nvPicPr>
+                  <pic:blipFill>
+                    <a:blip r:embed="rId14" cstate="none"/>
+                    <a:srcRect/>
+                    <a:stretch>
+                      <a:fillRect/>
+                    </a:stretch>
+                  </pic:blipFill>
+                  <pic:spPr bwMode="auto">
+                    <a:xfrm>
+                      <a:off x="0" y="0"/>
+                      <a:ext cx="5524500" cy="2714625"/>
+                    </a:xfrm>
+                    <a:prstGeom prst="rect">
+                      <a:avLst/>
+                    </a:prstGeom>
+                  </pic:spPr>
+                </pic:pic>
+              </a:graphicData>
+            </a:graphic>
+          </wp:inline>
+        </w:drawing>
+      </w:r>
+    </w:p>
+    <w:p>
+      <w:pPr>
+        <w:spacing w:after="200"/>
+        <w:jc w:val="center"/>
+      </w:pPr>
+      <w:r>
+        <w:rPr>
+          <w:rFonts w:ascii="Calibri" w:cs="Calibri" w:eastAsia="Calibri" w:hAnsi="Calibri"/>
+          <w:i/>
+          <w:iCs/>
+          <w:color w:val="666666"/>
+          <w:sz w:val="18"/>
+          <w:szCs w:val="18"/>
+        </w:rPr>
+        <w:t xml:space="preserve">Figure 6: User login via POST /api/auth/login</w:t>
+      </w:r>
+    </w:p>
+    <w:p>
+      <w:pPr>
+        <w:pStyle w:val="Heading2"/>
+        <w:spacing w:after="80" w:before="200"/>
+      </w:pPr>
+      <w:r>
+        <w:rPr>
+          <w:rFonts w:ascii="Calibri" w:cs="Calibri" w:eastAsia="Calibri" w:hAnsi="Calibri"/>
+          <w:b/>
+          <w:bCs/>
+          <w:color w:val="2E74B5"/>
+          <w:sz w:val="26"/>
+          <w:szCs w:val="26"/>
+        </w:rPr>
+        <w:t xml:space="preserve">Figure 7 — JWT Token Response</w:t>
+      </w:r>
+    </w:p>
+    <w:p>
+      <w:pPr>
+        <w:spacing w:after="60" w:before="120"/>
+        <w:jc w:val="center"/>
+      </w:pPr>
+      <w:r>
+        <w:drawing>
+          <wp:inline distT="0" distB="0" distL="0" distR="0">
+            <wp:extent cx="5524500" cy="2743200"/>
+            <wp:effectExtent t="0" r="0" b="0" l="0"/>
+            <wp:docPr id="1" name="Figure 7: JWT token returned after successful login — used for all subsequent requests" descr="Figure 7: JWT token returned after successful login — used for all subsequent requests" title="Figure 7: JWT token returned after successful login — used for all subsequent requests"/>
+            <wp:cNvGraphicFramePr>
+              <a:graphicFrameLocks xmlns:a="http://schemas.openxmlformats.org/drawingml/2006/main" noChangeAspect="1"/>
+            </wp:cNvGraphicFramePr>
+            <a:graphic xmlns:a="http://schemas.openxmlformats.org/drawingml/2006/main">
+              <a:graphicData uri="http://schemas.openxmlformats.org/drawingml/2006/picture">
+                <pic:pic xmlns:pic="http://schemas.openxmlformats.org/drawingml/2006/picture">
+                  <pic:nvPicPr>
+                    <pic:cNvPr id="0" name="" descr=""/>
+                    <pic:cNvPicPr>
+                      <a:picLocks noChangeAspect="1" noChangeArrowheads="1"/>
+                    </pic:cNvPicPr>
+                  </pic:nvPicPr>
+                  <pic:blipFill>
+                    <a:blip r:embed="rId15" cstate="none"/>
+                    <a:srcRect/>
+                    <a:stretch>
+                      <a:fillRect/>
+                    </a:stretch>
+                  </pic:blipFill>
+                  <pic:spPr bwMode="auto">
+                    <a:xfrm>
+                      <a:off x="0" y="0"/>
+                      <a:ext cx="5524500" cy="2743200"/>
+                    </a:xfrm>
+                    <a:prstGeom prst="rect">
+                      <a:avLst/>
+                    </a:prstGeom>
+                  </pic:spPr>
+                </pic:pic>
+              </a:graphicData>
+            </a:graphic>
+          </wp:inline>
+        </w:drawing>
+      </w:r>
+    </w:p>
+    <w:p>
+      <w:pPr>
+        <w:spacing w:after="200"/>
+        <w:jc w:val="center"/>
+      </w:pPr>
+      <w:r>
+        <w:rPr>
+          <w:rFonts w:ascii="Calibri" w:cs="Calibri" w:eastAsia="Calibri" w:hAnsi="Calibri"/>
+          <w:i/>
+          <w:iCs/>
+          <w:color w:val="666666"/>
+          <w:sz w:val="18"/>
+          <w:szCs w:val="18"/>
+        </w:rPr>
+        <w:t xml:space="preserve">Figure 7: JWT token returned after successful login — used for all subsequent requests</w:t>
+      </w:r>
+    </w:p>
+    <w:p>
+      <w:pPr>
+        <w:pStyle w:val="Heading2"/>
+        <w:spacing w:after="80" w:before="200"/>
+      </w:pPr>
+      <w:r>
+        <w:rPr>
+          <w:rFonts w:ascii="Calibri" w:cs="Calibri" w:eastAsia="Calibri" w:hAnsi="Calibri"/>
+          <w:b/>
+          <w:bCs/>
+          <w:color w:val="2E74B5"/>
+          <w:sz w:val="26"/>
+          <w:szCs w:val="26"/>
+        </w:rPr>
+        <w:t xml:space="preserve">Figure 8 — Create Task (POST /api/tasks)</w:t>
+      </w:r>
+    </w:p>
+    <w:p>
+      <w:pPr>
+        <w:spacing w:after="60" w:before="120"/>
+        <w:jc w:val="center"/>
+      </w:pPr>
+      <w:r>
+        <w:drawing>
+          <wp:inline distT="0" distB="0" distL="0" distR="0">
+            <wp:extent cx="5524500" cy="2695575"/>
+            <wp:effectExtent t="0" r="0" b="0" l="0"/>
+            <wp:docPr id="1" name="Figure 8: Creating a new task via POST /api/tasks with Bearer JWT token" descr="Figure 8: Creating a new task via POST /api/tasks with Bearer JWT token" title="Figure 8: Creating a new task via POST /api/tasks with Bearer JWT token"/>
+            <wp:cNvGraphicFramePr>
+              <a:graphicFrameLocks xmlns:a="http://schemas.openxmlformats.org/drawingml/2006/main" noChangeAspect="1"/>
+            </wp:cNvGraphicFramePr>
+            <a:graphic xmlns:a="http://schemas.openxmlformats.org/drawingml/2006/main">
+              <a:graphicData uri="http://schemas.openxmlformats.org/drawingml/2006/picture">
+                <pic:pic xmlns:pic="http://schemas.openxmlformats.org/drawingml/2006/picture">
+                  <pic:nvPicPr>
+                    <pic:cNvPr id="0" name="" descr=""/>
+                    <pic:cNvPicPr>
+                      <a:picLocks noChangeAspect="1" noChangeArrowheads="1"/>
+                    </pic:cNvPicPr>
+                  </pic:nvPicPr>
+                  <pic:blipFill>
+                    <a:blip r:embed="rId16" cstate="none"/>
+                    <a:srcRect/>
+                    <a:stretch>
+                      <a:fillRect/>
+                    </a:stretch>
+                  </pic:blipFill>
+                  <pic:spPr bwMode="auto">
+                    <a:xfrm>
+                      <a:off x="0" y="0"/>
+                      <a:ext cx="5524500" cy="2695575"/>
+                    </a:xfrm>
+                    <a:prstGeom prst="rect">
+                      <a:avLst/>
+                    </a:prstGeom>
+                  </pic:spPr>
+                </pic:pic>
+              </a:graphicData>
+            </a:graphic>
+          </wp:inline>
+        </w:drawing>
+      </w:r>
+    </w:p>
+    <w:p>
+      <w:pPr>
+        <w:spacing w:after="200"/>
+        <w:jc w:val="center"/>
+      </w:pPr>
+      <w:r>
+        <w:rPr>
+          <w:rFonts w:ascii="Calibri" w:cs="Calibri" w:eastAsia="Calibri" w:hAnsi="Calibri"/>
+          <w:i/>
+          <w:iCs/>
+          <w:color w:val="666666"/>
+          <w:sz w:val="18"/>
+          <w:szCs w:val="18"/>
+        </w:rPr>
+        <w:t xml:space="preserve">Figure 8: Creating a new task via POST /api/tasks with Bearer JWT token</w:t>
+      </w:r>
+    </w:p>
+    <w:p>
+      <w:pPr>
+        <w:pStyle w:val="Heading2"/>
+        <w:spacing w:after="80" w:before="200"/>
+      </w:pPr>
+      <w:r>
+        <w:rPr>
+          <w:rFonts w:ascii="Calibri" w:cs="Calibri" w:eastAsia="Calibri" w:hAnsi="Calibri"/>
+          <w:b/>
+          <w:bCs/>
+          <w:color w:val="2E74B5"/>
+          <w:sz w:val="26"/>
+          <w:szCs w:val="26"/>
+        </w:rPr>
+        <w:t xml:space="preserve">Figure 9 — Create Task Response</w:t>
+      </w:r>
+    </w:p>
+    <w:p>
+      <w:pPr>
+        <w:spacing w:after="60" w:before="120"/>
+        <w:jc w:val="center"/>
+      </w:pPr>
+      <w:r>
+        <w:drawing>
+          <wp:inline distT="0" distB="0" distL="0" distR="0">
+            <wp:extent cx="5524500" cy="2724150"/>
+            <wp:effectExtent t="0" r="0" b="0" l="0"/>
+            <wp:docPr id="1" name="Figure 9: Task created successfully — response with task ID and details" descr="Figure 9: Task created successfully — response with task ID and details" title="Figure 9: Task created successfully — response with task ID and details"/>
+            <wp:cNvGraphicFramePr>
+              <a:graphicFrameLocks xmlns:a="http://schemas.openxmlformats.org/drawingml/2006/main" noChangeAspect="1"/>
+            </wp:cNvGraphicFramePr>
+            <a:graphic xmlns:a="http://schemas.openxmlformats.org/drawingml/2006/main">
+              <a:graphicData uri="http://schemas.openxmlformats.org/drawingml/2006/picture">
+                <pic:pic xmlns:pic="http://schemas.openxmlformats.org/drawingml/2006/picture">
+                  <pic:nvPicPr>
+                    <pic:cNvPr id="0" name="" descr=""/>
+                    <pic:cNvPicPr>
+                      <a:picLocks noChangeAspect="1" noChangeArrowheads="1"/>
+                    </pic:cNvPicPr>
+                  </pic:nvPicPr>
+                  <pic:blipFill>
+                    <a:blip r:embed="rId17" cstate="none"/>
+                    <a:srcRect/>
+                    <a:stretch>
+                      <a:fillRect/>
+                    </a:stretch>
+                  </pic:blipFill>
+                  <pic:spPr bwMode="auto">
+                    <a:xfrm>
+                      <a:off x="0" y="0"/>
+                      <a:ext cx="5524500" cy="2724150"/>
+                    </a:xfrm>
+                    <a:prstGeom prst="rect">
+                      <a:avLst/>
+                    </a:prstGeom>
+                  </pic:spPr>
+                </pic:pic>
+              </a:graphicData>
+            </a:graphic>
+          </wp:inline>
+        </w:drawing>
+      </w:r>
+    </w:p>
+    <w:p>
+      <w:pPr>
+        <w:spacing w:after="200"/>
+        <w:jc w:val="center"/>
+      </w:pPr>
+      <w:r>
+        <w:rPr>
+          <w:rFonts w:ascii="Calibri" w:cs="Calibri" w:eastAsia="Calibri" w:hAnsi="Calibri"/>
+          <w:i/>
+          <w:iCs/>
+          <w:color w:val="666666"/>
+          <w:sz w:val="18"/>
+          <w:szCs w:val="18"/>
+        </w:rPr>
+        <w:t xml:space="preserve">Figure 9: Task created successfully — response with task ID and details</w:t>
+      </w:r>
+    </w:p>
+    <w:p>
+      <w:pPr>
+        <w:pStyle w:val="Heading2"/>
+        <w:spacing w:after="80" w:before="200"/>
+      </w:pPr>
+      <w:r>
+        <w:rPr>
+          <w:rFonts w:ascii="Calibri" w:cs="Calibri" w:eastAsia="Calibri" w:hAnsi="Calibri"/>
+          <w:b/>
+          <w:bCs/>
+          <w:color w:val="2E74B5"/>
+          <w:sz w:val="26"/>
+          <w:szCs w:val="26"/>
+        </w:rPr>
+        <w:t xml:space="preserve">Figure 10 — Get Tasks (GET /api/tasks)</w:t>
+      </w:r>
+    </w:p>
+    <w:p>
+      <w:pPr>
+        <w:spacing w:after="60" w:before="120"/>
+        <w:jc w:val="center"/>
+      </w:pPr>
+      <w:r>
+        <w:drawing>
+          <wp:inline distT="0" distB="0" distL="0" distR="0">
+            <wp:extent cx="5524500" cy="2714625"/>
+            <wp:effectExtent t="0" r="0" b="0" l="0"/>
+            <wp:docPr id="1" name="Figure 10: Retrieving all tasks via GET /api/tasks" descr="Figure 10: Retrieving all tasks via GET /api/tasks" title="Figure 10: Retrieving all tasks via GET /api/tasks"/>
+            <wp:cNvGraphicFramePr>
+              <a:graphicFrameLocks xmlns:a="http://schemas.openxmlformats.org/drawingml/2006/main" noChangeAspect="1"/>
+            </wp:cNvGraphicFramePr>
+            <a:graphic xmlns:a="http://schemas.openxmlformats.org/drawingml/2006/main">
+              <a:graphicData uri="http://schemas.openxmlformats.org/drawingml/2006/picture">
+                <pic:pic xmlns:pic="http://schemas.openxmlformats.org/drawingml/2006/picture">
+                  <pic:nvPicPr>
+                    <pic:cNvPr id="0" name="" descr=""/>
+                    <pic:cNvPicPr>
+                      <a:picLocks noChangeAspect="1" noChangeArrowheads="1"/>
+                    </pic:cNvPicPr>
+                  </pic:nvPicPr>
+                  <pic:blipFill>
+                    <a:blip r:embed="rId18" cstate="none"/>
+                    <a:srcRect/>
+                    <a:stretch>
+                      <a:fillRect/>
+                    </a:stretch>
+                  </pic:blipFill>
+                  <pic:spPr bwMode="auto">
+                    <a:xfrm>
+                      <a:off x="0" y="0"/>
+                      <a:ext cx="5524500" cy="2714625"/>
+                    </a:xfrm>
+                    <a:prstGeom prst="rect">
+                      <a:avLst/>
+                    </a:prstGeom>
+                  </pic:spPr>
+                </pic:pic>
+              </a:graphicData>
+            </a:graphic>
+          </wp:inline>
+        </w:drawing>
+      </w:r>
+    </w:p>
+    <w:p>
+      <w:pPr>
+        <w:spacing w:after="200"/>
+        <w:jc w:val="center"/>
+      </w:pPr>
+      <w:r>
+        <w:rPr>
+          <w:rFonts w:ascii="Calibri" w:cs="Calibri" w:eastAsia="Calibri" w:hAnsi="Calibri"/>
+          <w:i/>
+          <w:iCs/>
+          <w:color w:val="666666"/>
+          <w:sz w:val="18"/>
+          <w:szCs w:val="18"/>
+        </w:rPr>
+        <w:t xml:space="preserve">Figure 10: Retrieving all tasks via GET /api/tasks</w:t>
+      </w:r>
+    </w:p>
+    <w:p>
+      <w:pPr>
+        <w:pStyle w:val="Heading2"/>
+        <w:spacing w:after="80" w:before="200"/>
+      </w:pPr>
+      <w:r>
+        <w:rPr>
+          <w:rFonts w:ascii="Calibri" w:cs="Calibri" w:eastAsia="Calibri" w:hAnsi="Calibri"/>
+          <w:b/>
+          <w:bCs/>
+          <w:color w:val="2E74B5"/>
+          <w:sz w:val="26"/>
+          <w:szCs w:val="26"/>
+        </w:rPr>
+        <w:t xml:space="preserve">Figure 11 — H2 Console — User Service</w:t>
+      </w:r>
+    </w:p>
+    <w:p>
+      <w:pPr>
+        <w:spacing w:after="60" w:before="120"/>
+        <w:jc w:val="center"/>
+      </w:pPr>
+      <w:r>
+        <w:drawing>
+          <wp:inline distT="0" distB="0" distL="0" distR="0">
+            <wp:extent cx="5524500" cy="2733675"/>
+            <wp:effectExtent t="0" r="0" b="0" l="0"/>
+            <wp:docPr id="1" name="Figure 11: H2 in-memory database console for User Service (userdb) showing users table" descr="Figure 11: H2 in-memory database console for User Service (userdb) showing users table" title="Figure 11: H2 in-memory database console for User Service (userdb) showing users table"/>
+            <wp:cNvGraphicFramePr>
+              <a:graphicFrameLocks xmlns:a="http://schemas.openxmlformats.org/drawingml/2006/main" noChangeAspect="1"/>
+            </wp:cNvGraphicFramePr>
+            <a:graphic xmlns:a="http://schemas.openxmlformats.org/drawingml/2006/main">
+              <a:graphicData uri="http://schemas.openxmlformats.org/drawingml/2006/picture">
+                <pic:pic xmlns:pic="http://schemas.openxmlformats.org/drawingml/2006/picture">
+                  <pic:nvPicPr>
+                    <pic:cNvPr id="0" name="" descr=""/>
+                    <pic:cNvPicPr>
+                      <a:picLocks noChangeAspect="1" noChangeArrowheads="1"/>
+                    </pic:cNvPicPr>
+                  </pic:nvPicPr>
+                  <pic:blipFill>
+                    <a:blip r:embed="rId19" cstate="none"/>
+                    <a:srcRect/>
+                    <a:stretch>
+                      <a:fillRect/>
+                    </a:stretch>
+                  </pic:blipFill>
+                  <pic:spPr bwMode="auto">
+                    <a:xfrm>
+                      <a:off x="0" y="0"/>
+                      <a:ext cx="5524500" cy="2733675"/>
+                    </a:xfrm>
+                    <a:prstGeom prst="rect">
+                      <a:avLst/>
+                    </a:prstGeom>
+                  </pic:spPr>
+                </pic:pic>
+              </a:graphicData>
+            </a:graphic>
+          </wp:inline>
+        </w:drawing>
+      </w:r>
+    </w:p>
+    <w:p>
+      <w:pPr>
+        <w:spacing w:after="200"/>
+        <w:jc w:val="center"/>
+      </w:pPr>
+      <w:r>
+        <w:rPr>
+          <w:rFonts w:ascii="Calibri" w:cs="Calibri" w:eastAsia="Calibri" w:hAnsi="Calibri"/>
+          <w:i/>
+          <w:iCs/>
+          <w:color w:val="666666"/>
+          <w:sz w:val="18"/>
+          <w:szCs w:val="18"/>
+        </w:rPr>
+        <w:t xml:space="preserve">Figure 11: H2 in-memory database console for User Service (userdb) showing users table</w:t>
+      </w:r>
+    </w:p>
+    <w:p>
+      <w:pPr>
+        <w:pStyle w:val="Heading2"/>
+        <w:spacing w:after="80" w:before="200"/>
+      </w:pPr>
+      <w:r>
+        <w:rPr>
+          <w:rFonts w:ascii="Calibri" w:cs="Calibri" w:eastAsia="Calibri" w:hAnsi="Calibri"/>
+          <w:b/>
+          <w:bCs/>
+          <w:color w:val="2E74B5"/>
+          <w:sz w:val="26"/>
+          <w:szCs w:val="26"/>
+        </w:rPr>
+        <w:t xml:space="preserve">Figure 12 — H2 Console — Task Service</w:t>
+      </w:r>
+    </w:p>
+    <w:p>
+      <w:pPr>
+        <w:spacing w:after="60" w:before="120"/>
+        <w:jc w:val="center"/>
+      </w:pPr>
+      <w:r>
+        <w:drawing>
+          <wp:inline distT="0" distB="0" distL="0" distR="0">
+            <wp:extent cx="5524500" cy="2724150"/>
+            <wp:effectExtent t="0" r="0" b="0" l="0"/>
+            <wp:docPr id="1" name="Figure 12: H2 in-memory database console for Task Service (taskdb) showing tasks table" descr="Figure 12: H2 in-memory database console for Task Service (taskdb) showing tasks table" title="Figure 12: H2 in-memory database console for Task Service (taskdb) showing tasks table"/>
+            <wp:cNvGraphicFramePr>
+              <a:graphicFrameLocks xmlns:a="http://schemas.openxmlformats.org/drawingml/2006/main" noChangeAspect="1"/>
+            </wp:cNvGraphicFramePr>
+            <a:graphic xmlns:a="http://schemas.openxmlformats.org/drawingml/2006/main">
+              <a:graphicData uri="http://schemas.openxmlformats.org/drawingml/2006/picture">
+                <pic:pic xmlns:pic="http://schemas.openxmlformats.org/drawingml/2006/picture">
+                  <pic:nvPicPr>
+                    <pic:cNvPr id="0" name="" descr=""/>
+                    <pic:cNvPicPr>
+                      <a:picLocks noChangeAspect="1" noChangeArrowheads="1"/>
+                    </pic:cNvPicPr>
+                  </pic:nvPicPr>
+                  <pic:blipFill>
+                    <a:blip r:embed="rId20" cstate="none"/>
+                    <a:srcRect/>
+                    <a:stretch>
+                      <a:fillRect/>
+                    </a:stretch>
+                  </pic:blipFill>
+                  <pic:spPr bwMode="auto">
+                    <a:xfrm>
+                      <a:off x="0" y="0"/>
+                      <a:ext cx="5524500" cy="2724150"/>
+                    </a:xfrm>
+                    <a:prstGeom prst="rect">
+                      <a:avLst/>
+                    </a:prstGeom>
+                  </pic:spPr>
+                </pic:pic>
+              </a:graphicData>
+            </a:graphic>
+          </wp:inline>
+        </w:drawing>
+      </w:r>
+    </w:p>
+    <w:p>
+      <w:pPr>
+        <w:spacing w:after="200"/>
+        <w:jc w:val="center"/>
+      </w:pPr>
+      <w:r>
+        <w:rPr>
+          <w:rFonts w:ascii="Calibri" w:cs="Calibri" w:eastAsia="Calibri" w:hAnsi="Calibri"/>
+          <w:i/>
+          <w:iCs/>
+          <w:color w:val="666666"/>
+          <w:sz w:val="18"/>
+          <w:szCs w:val="18"/>
+        </w:rPr>
+        <w:t xml:space="preserve">Figure 12: H2 in-memory database console for Task Service (taskdb) showing tasks table</w:t>
+      </w:r>
+    </w:p>
+    <w:p>
+      <w:pPr>
+        <w:pStyle w:val="Heading2"/>
+        <w:spacing w:after="80" w:before="200"/>
+      </w:pPr>
+      <w:r>
+        <w:rPr>
+          <w:rFonts w:ascii="Calibri" w:cs="Calibri" w:eastAsia="Calibri" w:hAnsi="Calibri"/>
+          <w:b/>
+          <w:bCs/>
+          <w:color w:val="2E74B5"/>
+          <w:sz w:val="26"/>
+          <w:szCs w:val="26"/>
+        </w:rPr>
+        <w:t xml:space="preserve">Figure 13 — User Service GitHub Repository</w:t>
+      </w:r>
+    </w:p>
+    <w:p>
+      <w:pPr>
+        <w:spacing w:after="60" w:before="120"/>
+        <w:jc w:val="center"/>
+      </w:pPr>
+      <w:r>
+        <w:drawing>
+          <wp:inline distT="0" distB="0" distL="0" distR="0">
+            <wp:extent cx="5524500" cy="2733675"/>
+            <wp:effectExtent t="0" r="0" b="0" l="0"/>
+            <wp:docPr id="1" name="Figure 13: User Service GitHub repository — github.com/jeevankumargujja/user-service" descr="Figure 13: User Service GitHub repository — github.com/jeevankumargujja/user-service" title="Figure 13: User Service GitHub repository — github.com/jeevankumargujja/user-service"/>
+            <wp:cNvGraphicFramePr>
+              <a:graphicFrameLocks xmlns:a="http://schemas.openxmlformats.org/drawingml/2006/main" noChangeAspect="1"/>
+            </wp:cNvGraphicFramePr>
+            <a:graphic xmlns:a="http://schemas.openxmlformats.org/drawingml/2006/main">
+              <a:graphicData uri="http://schemas.openxmlformats.org/drawingml/2006/picture">
+                <pic:pic xmlns:pic="http://schemas.openxmlformats.org/drawingml/2006/picture">
+                  <pic:nvPicPr>
+                    <pic:cNvPr id="0" name="" descr=""/>
+                    <pic:cNvPicPr>
+                      <a:picLocks noChangeAspect="1" noChangeArrowheads="1"/>
+                    </pic:cNvPicPr>
+                  </pic:nvPicPr>
+                  <pic:blipFill>
+                    <a:blip r:embed="rId21" cstate="none"/>
+                    <a:srcRect/>
+                    <a:stretch>
+                      <a:fillRect/>
+                    </a:stretch>
+                  </pic:blipFill>
+                  <pic:spPr bwMode="auto">
+                    <a:xfrm>
+                      <a:off x="0" y="0"/>
+                      <a:ext cx="5524500" cy="2733675"/>
+                    </a:xfrm>
+                    <a:prstGeom prst="rect">
+                      <a:avLst/>
+                    </a:prstGeom>
+                  </pic:spPr>
+                </pic:pic>
+              </a:graphicData>
+            </a:graphic>
+          </wp:inline>
+        </w:drawing>
+      </w:r>
+    </w:p>
+    <w:p>
+      <w:pPr>
+        <w:spacing w:after="200"/>
+        <w:jc w:val="center"/>
+      </w:pPr>
+      <w:r>
+        <w:rPr>
+          <w:rFonts w:ascii="Calibri" w:cs="Calibri" w:eastAsia="Calibri" w:hAnsi="Calibri"/>
+          <w:i/>
+          <w:iCs/>
+          <w:color w:val="666666"/>
+          <w:sz w:val="18"/>
+          <w:szCs w:val="18"/>
+        </w:rPr>
+        <w:t xml:space="preserve">Figure 13: User Service GitHub repository — github.com/jeevankumargujja/user-service</w:t>
+      </w:r>
+    </w:p>
+    <w:p>
+      <w:pPr>
+        <w:pStyle w:val="Heading2"/>
+        <w:spacing w:after="80" w:before="200"/>
+      </w:pPr>
+      <w:r>
+        <w:rPr>
+          <w:rFonts w:ascii="Calibri" w:cs="Calibri" w:eastAsia="Calibri" w:hAnsi="Calibri"/>
+          <w:b/>
+          <w:bCs/>
+          <w:color w:val="2E74B5"/>
+          <w:sz w:val="26"/>
+          <w:szCs w:val="26"/>
+        </w:rPr>
+        <w:t xml:space="preserve">Figure 14 — Task Service GitHub Repository</w:t>
+      </w:r>
+    </w:p>
+    <w:p>
+      <w:pPr>
+        <w:spacing w:after="60" w:before="120"/>
+        <w:jc w:val="center"/>
+      </w:pPr>
+      <w:r>
+        <w:drawing>
+          <wp:inline distT="0" distB="0" distL="0" distR="0">
+            <wp:extent cx="5524500" cy="2590800"/>
+            <wp:effectExtent t="0" r="0" b="0" l="0"/>
+            <wp:docPr id="1" name="Figure 14: Task Service GitHub repository — github.com/jeevankumargujja/task-service" descr="Figure 14: Task Service GitHub repository — github.com/jeevankumargujja/task-service" title="Figure 14: Task Service GitHub repository — github.com/jeevankumargujja/task-service"/>
+            <wp:cNvGraphicFramePr>
+              <a:graphicFrameLocks xmlns:a="http://schemas.openxmlformats.org/drawingml/2006/main" noChangeAspect="1"/>
+            </wp:cNvGraphicFramePr>
+            <a:graphic xmlns:a="http://schemas.openxmlformats.org/drawingml/2006/main">
+              <a:graphicData uri="http://schemas.openxmlformats.org/drawingml/2006/picture">
+                <pic:pic xmlns:pic="http://schemas.openxmlformats.org/drawingml/2006/picture">
+                  <pic:nvPicPr>
+                    <pic:cNvPr id="0" name="" descr=""/>
+                    <pic:cNvPicPr>
+                      <a:picLocks noChangeAspect="1" noChangeArrowheads="1"/>
+                    </pic:cNvPicPr>
+                  </pic:nvPicPr>
+                  <pic:blipFill>
+                    <a:blip r:embed="rId22" cstate="none"/>
+                    <a:srcRect/>
+                    <a:stretch>
+                      <a:fillRect/>
+                    </a:stretch>
+                  </pic:blipFill>
+                  <pic:spPr bwMode="auto">
+                    <a:xfrm>
+                      <a:off x="0" y="0"/>
+                      <a:ext cx="5524500" cy="2590800"/>
+                    </a:xfrm>
+                    <a:prstGeom prst="rect">
+                      <a:avLst/>
+                    </a:prstGeom>
+                  </pic:spPr>
+                </pic:pic>
+              </a:graphicData>
+            </a:graphic>
+          </wp:inline>
+        </w:drawing>
+      </w:r>
+    </w:p>
+    <w:p>
+      <w:pPr>
+        <w:spacing w:after="200"/>
+        <w:jc w:val="center"/>
+      </w:pPr>
+      <w:r>
+        <w:rPr>
+          <w:rFonts w:ascii="Calibri" w:cs="Calibri" w:eastAsia="Calibri" w:hAnsi="Calibri"/>
+          <w:i/>
+          <w:iCs/>
+          <w:color w:val="666666"/>
+          <w:sz w:val="18"/>
+          <w:szCs w:val="18"/>
+        </w:rPr>
+        <w:t xml:space="preserve">Figure 14: Task Service GitHub repository — github.com/jeevankumargujja/task-service</w:t>
+      </w:r>
+    </w:p>
+    <w:p>
+      <w:pPr>
+        <w:pStyle w:val="Heading2"/>
+        <w:spacing w:after="80" w:before="200"/>
+      </w:pPr>
+      <w:r>
+        <w:rPr>
+          <w:rFonts w:ascii="Calibri" w:cs="Calibri" w:eastAsia="Calibri" w:hAnsi="Calibri"/>
+          <w:b/>
+          <w:bCs/>
+          <w:color w:val="2E74B5"/>
+          <w:sz w:val="26"/>
+          <w:szCs w:val="26"/>
+        </w:rPr>
+        <w:t xml:space="preserve">Figure 15 — User Service README</w:t>
+      </w:r>
+    </w:p>
+    <w:p>
+      <w:pPr>
+        <w:spacing w:after="60" w:before="120"/>
+        <w:jc w:val="center"/>
+      </w:pPr>
+      <w:r>
+        <w:drawing>
+          <wp:inline distT="0" distB="0" distL="0" distR="0">
+            <wp:extent cx="5524500" cy="2581275"/>
+            <wp:effectExtent t="0" r="0" b="0" l="0"/>
+            <wp:docPr id="1" name="Figure 15: User Service README with API documentation and setup guide" descr="Figure 15: User Service README with API documentation and setup guide" title="Figure 15: User Service README with API documentation and setup guide"/>
+            <wp:cNvGraphicFramePr>
+              <a:graphicFrameLocks xmlns:a="http://schemas.openxmlformats.org/drawingml/2006/main" noChangeAspect="1"/>
+            </wp:cNvGraphicFramePr>
+            <a:graphic xmlns:a="http://schemas.openxmlformats.org/drawingml/2006/main">
+              <a:graphicData uri="http://schemas.openxmlformats.org/drawingml/2006/picture">
+                <pic:pic xmlns:pic="http://schemas.openxmlformats.org/drawingml/2006/picture">
+                  <pic:nvPicPr>
+                    <pic:cNvPr id="0" name="" descr=""/>
+                    <pic:cNvPicPr>
+                      <a:picLocks noChangeAspect="1" noChangeArrowheads="1"/>
+                    </pic:cNvPicPr>
+                  </pic:nvPicPr>
+                  <pic:blipFill>
+                    <a:blip r:embed="rId23" cstate="none"/>
+                    <a:srcRect/>
+                    <a:stretch>
+                      <a:fillRect/>
+                    </a:stretch>
+                  </pic:blipFill>
+                  <pic:spPr bwMode="auto">
+                    <a:xfrm>
+                      <a:off x="0" y="0"/>
+                      <a:ext cx="5524500" cy="2581275"/>
+                    </a:xfrm>
+                    <a:prstGeom prst="rect">
+                      <a:avLst/>
+                    </a:prstGeom>
+                  </pic:spPr>
+                </pic:pic>
+              </a:graphicData>
+            </a:graphic>
+          </wp:inline>
+        </w:drawing>
+      </w:r>
+    </w:p>
+    <w:p>
+      <w:pPr>
+        <w:spacing w:after="200"/>
+        <w:jc w:val="center"/>
+      </w:pPr>
+      <w:r>
+        <w:rPr>
+          <w:rFonts w:ascii="Calibri" w:cs="Calibri" w:eastAsia="Calibri" w:hAnsi="Calibri"/>
+          <w:i/>
+          <w:iCs/>
+          <w:color w:val="666666"/>
+          <w:sz w:val="18"/>
+          <w:szCs w:val="18"/>
+        </w:rPr>
+        <w:t xml:space="preserve">Figure 15: User Service README with API documentation and setup guide</w:t>
+      </w:r>
+    </w:p>
+    <w:p>
+      <w:pPr>
+        <w:pStyle w:val="Heading2"/>
+        <w:spacing w:after="80" w:before="200"/>
+      </w:pPr>
+      <w:r>
+        <w:rPr>
+          <w:rFonts w:ascii="Calibri" w:cs="Calibri" w:eastAsia="Calibri" w:hAnsi="Calibri"/>
+          <w:b/>
+          <w:bCs/>
+          <w:color w:val="2E74B5"/>
+          <w:sz w:val="26"/>
+          <w:szCs w:val="26"/>
+        </w:rPr>
+        <w:t xml:space="preserve">Figure 16 — Task Service README</w:t>
+      </w:r>
+    </w:p>
+    <w:p>
+      <w:pPr>
+        <w:spacing w:after="60" w:before="120"/>
+        <w:jc w:val="center"/>
+      </w:pPr>
+      <w:r>
+        <w:drawing>
+          <wp:inline distT="0" distB="0" distL="0" distR="0">
+            <wp:extent cx="5524500" cy="2676525"/>
+            <wp:effectExtent t="0" r="0" b="0" l="0"/>
+            <wp:docPr id="1" name="Figure 16: Task Service README with API endpoints, RBAC table, and inter-service communication notes" descr="Figure 16: Task Service README with API endpoints, RBAC table, and inter-service communication notes" title="Figure 16: Task Service README with API endpoints, RBAC table, and inter-service communication notes"/>
+            <wp:cNvGraphicFramePr>
+              <a:graphicFrameLocks xmlns:a="http://schemas.openxmlformats.org/drawingml/2006/main" noChangeAspect="1"/>
+            </wp:cNvGraphicFramePr>
+            <a:graphic xmlns:a="http://schemas.openxmlformats.org/drawingml/2006/main">
+              <a:graphicData uri="http://schemas.openxmlformats.org/drawingml/2006/picture">
+                <pic:pic xmlns:pic="http://schemas.openxmlformats.org/drawingml/2006/picture">
+                  <pic:nvPicPr>
+                    <pic:cNvPr id="0" name="" descr=""/>
+                    <pic:cNvPicPr>
+                      <a:picLocks noChangeAspect="1" noChangeArrowheads="1"/>
+                    </pic:cNvPicPr>
+                  </pic:nvPicPr>
+                  <pic:blipFill>
+                    <a:blip r:embed="rId24" cstate="none"/>
+                    <a:srcRect/>
+                    <a:stretch>
+                      <a:fillRect/>
+                    </a:stretch>
+                  </pic:blipFill>
+                  <pic:spPr bwMode="auto">
+                    <a:xfrm>
+                      <a:off x="0" y="0"/>
+                      <a:ext cx="5524500" cy="2676525"/>
+                    </a:xfrm>
+                    <a:prstGeom prst="rect">
+                      <a:avLst/>
+                    </a:prstGeom>
+                  </pic:spPr>
+                </pic:pic>
+              </a:graphicData>
+            </a:graphic>
+          </wp:inline>
+        </w:drawing>
+      </w:r>
+    </w:p>
+    <w:p>
+      <w:pPr>
+        <w:spacing w:after="200"/>
+        <w:jc w:val="center"/>
+      </w:pPr>
+      <w:r>
+        <w:rPr>
+          <w:rFonts w:ascii="Calibri" w:cs="Calibri" w:eastAsia="Calibri" w:hAnsi="Calibri"/>
+          <w:i/>
+          <w:iCs/>
+          <w:color w:val="666666"/>
+          <w:sz w:val="18"/>
+          <w:szCs w:val="18"/>
+        </w:rPr>
+        <w:t xml:space="preserve">Figure 16: Task Service README with API endpoints, RBAC table, and inter-service communication notes</w:t>
+      </w:r>
+    </w:p>
+    <w:p>
+      <w:r>
+        <w:br w:type="page"/>
+      </w:r>
+    </w:p>
+    <w:p>
+      <w:pPr>
+        <w:pStyle w:val="Heading1"/>
+        <w:spacing w:after="120" w:before="320"/>
+      </w:pPr>
+      <w:r>
+        <w:rPr>
+          <w:rFonts w:ascii="Calibri" w:cs="Calibri" w:eastAsia="Calibri" w:hAnsi="Calibri"/>
+          <w:b/>
+          <w:bCs/>
+          <w:color w:val="1F3864"/>
+          <w:sz w:val="32"/>
+          <w:szCs w:val="32"/>
+        </w:rPr>
+        <w:t xml:space="preserve">9. Trainee Declaration</w:t>
       </w:r>
     </w:p>
     <w:p>

</xml_diff>